<commit_message>
feat: add my student id
</commit_message>
<xml_diff>
--- a/Assignment 1 Documentation.docx
+++ b/Assignment 1 Documentation.docx
@@ -1,6 +1,6 @@
 
 <file path=word/document.xml><?xml version="1.0" encoding="utf-8"?>
-<w:document xmlns:wpc="http://schemas.microsoft.com/office/word/2010/wordprocessingCanvas" xmlns:cx="http://schemas.microsoft.com/office/drawing/2014/chartex" xmlns:cx1="http://schemas.microsoft.com/office/drawing/2015/9/8/chartex" xmlns:cx2="http://schemas.microsoft.com/office/drawing/2015/10/21/chartex" xmlns:cx3="http://schemas.microsoft.com/office/drawing/2016/5/9/chartex" xmlns:cx4="http://schemas.microsoft.com/office/drawing/2016/5/10/chartex" xmlns:cx5="http://schemas.microsoft.com/office/drawing/2016/5/11/chartex" xmlns:cx6="http://schemas.microsoft.com/office/drawing/2016/5/12/chartex" xmlns:cx7="http://schemas.microsoft.com/office/drawing/2016/5/13/chartex" xmlns:cx8="http://schemas.microsoft.com/office/drawing/2016/5/14/chartex" xmlns:mc="http://schemas.openxmlformats.org/markup-compatibility/2006" xmlns:aink="http://schemas.microsoft.com/office/drawing/2016/ink" xmlns:am3d="http://schemas.microsoft.com/office/drawing/2017/model3d" xmlns:o="urn:schemas-microsoft-com:office:office" xmlns:oel="http://schemas.microsoft.com/office/2019/extlst" xmlns:r="http://schemas.openxmlformats.org/officeDocument/2006/relationships" xmlns:m="http://schemas.openxmlformats.org/officeDocument/2006/math" xmlns:v="urn:schemas-microsoft-com:vml" xmlns:wp14="http://schemas.microsoft.com/office/word/2010/wordprocessingDrawing" xmlns:wp="http://schemas.openxmlformats.org/drawingml/2006/wordprocessingDrawing" xmlns:w10="urn:schemas-microsoft-com:office:word" xmlns:w="http://schemas.openxmlformats.org/wordprocessingml/2006/main" xmlns:w14="http://schemas.microsoft.com/office/word/2010/wordml" xmlns:w15="http://schemas.microsoft.com/office/word/2012/wordml" xmlns:w16cei="http://schemas.microsoft.com/office/word/2026/wordml/cei" xmlns:w16cex="http://schemas.microsoft.com/office/word/2018/wordml/cex" xmlns:w16cid="http://schemas.microsoft.com/office/word/2016/wordml/cid" xmlns:w16="http://schemas.microsoft.com/office/word/2018/wordml" xmlns:w16du="http://schemas.microsoft.com/office/word/2023/wordml/word16du" xmlns:w16sdtdh="http://schemas.microsoft.com/office/word/2020/wordml/sdtdatahash" xmlns:w16sdtfl="http://schemas.microsoft.com/office/word/2024/wordml/sdtformatlock" xmlns:w16se="http://schemas.microsoft.com/office/word/2015/wordml/symex" xmlns:wpg="http://schemas.microsoft.com/office/word/2010/wordprocessingGroup" xmlns:wpi="http://schemas.microsoft.com/office/word/2010/wordprocessingInk" xmlns:wne="http://schemas.microsoft.com/office/word/2006/wordml" xmlns:wps="http://schemas.microsoft.com/office/word/2010/wordprocessingShape" mc:Ignorable="w14 w15 w16se w16cid w16 w16cex w16sdtdh w16sdtfl w16du wp14">
+<w:document xmlns:wpc="http://schemas.microsoft.com/office/word/2010/wordprocessingCanvas" xmlns:cx="http://schemas.microsoft.com/office/drawing/2014/chartex" xmlns:cx1="http://schemas.microsoft.com/office/drawing/2015/9/8/chartex" xmlns:cx2="http://schemas.microsoft.com/office/drawing/2015/10/21/chartex" xmlns:cx3="http://schemas.microsoft.com/office/drawing/2016/5/9/chartex" xmlns:cx4="http://schemas.microsoft.com/office/drawing/2016/5/10/chartex" xmlns:cx5="http://schemas.microsoft.com/office/drawing/2016/5/11/chartex" xmlns:cx6="http://schemas.microsoft.com/office/drawing/2016/5/12/chartex" xmlns:cx7="http://schemas.microsoft.com/office/drawing/2016/5/13/chartex" xmlns:cx8="http://schemas.microsoft.com/office/drawing/2016/5/14/chartex" xmlns:mc="http://schemas.openxmlformats.org/markup-compatibility/2006" xmlns:aink="http://schemas.microsoft.com/office/drawing/2016/ink" xmlns:am3d="http://schemas.microsoft.com/office/drawing/2017/model3d" xmlns:o="urn:schemas-microsoft-com:office:office" xmlns:r="http://schemas.openxmlformats.org/officeDocument/2006/relationships" xmlns:m="http://schemas.openxmlformats.org/officeDocument/2006/math" xmlns:v="urn:schemas-microsoft-com:vml" xmlns:wp14="http://schemas.microsoft.com/office/word/2010/wordprocessingDrawing" xmlns:wp="http://schemas.openxmlformats.org/drawingml/2006/wordprocessingDrawing" xmlns:w10="urn:schemas-microsoft-com:office:word" xmlns:w="http://schemas.openxmlformats.org/wordprocessingml/2006/main" xmlns:w14="http://schemas.microsoft.com/office/word/2010/wordml" xmlns:w15="http://schemas.microsoft.com/office/word/2012/wordml" xmlns:w16cex="http://schemas.microsoft.com/office/word/2018/wordml/cex" xmlns:w16cid="http://schemas.microsoft.com/office/word/2016/wordml/cid" xmlns:w16="http://schemas.microsoft.com/office/word/2018/wordml" xmlns:w16sdtdh="http://schemas.microsoft.com/office/word/2020/wordml/sdtdatahash" xmlns:w16se="http://schemas.microsoft.com/office/word/2015/wordml/symex" xmlns:wpg="http://schemas.microsoft.com/office/word/2010/wordprocessingGroup" xmlns:wpi="http://schemas.microsoft.com/office/word/2010/wordprocessingInk" xmlns:wne="http://schemas.microsoft.com/office/word/2006/wordml" xmlns:wps="http://schemas.microsoft.com/office/word/2010/wordprocessingShape" mc:Ignorable="w14 w15 w16se w16cid w16 w16cex w16sdtdh wp14">
   <w:body>
     <w:p>
       <w:pPr>
@@ -46,26 +46,12 @@
         <w:rPr>
           <w:lang w:val="en-US"/>
         </w:rPr>
-        <w:t xml:space="preserve"> I’ve created the repository and the default java </w:t>
+        <w:t xml:space="preserve"> I’ve created the repository and the default java files, and pushed them to the repository. To do:</w:t>
       </w:r>
-      <w:proofErr w:type="gramStart"/>
-      <w:r>
-        <w:rPr>
-          <w:lang w:val="en-US"/>
-        </w:rPr>
-        <w:t>files, and</w:t>
-      </w:r>
-      <w:proofErr w:type="gramEnd"/>
-      <w:r>
-        <w:rPr>
-          <w:lang w:val="en-US"/>
-        </w:rPr>
-        <w:t xml:space="preserve"> pushed them to the repository. To do:</w:t>
-      </w:r>
-    </w:p>
-    <w:p>
-      <w:pPr>
-        <w:pStyle w:val="ListParagraph"/>
+    </w:p>
+    <w:p>
+      <w:pPr>
+        <w:pStyle w:val="a6"/>
         <w:numPr>
           <w:ilvl w:val="0"/>
           <w:numId w:val="1"/>
@@ -83,7 +69,7 @@
     </w:p>
     <w:p>
       <w:pPr>
-        <w:pStyle w:val="ListParagraph"/>
+        <w:pStyle w:val="a6"/>
         <w:numPr>
           <w:ilvl w:val="1"/>
           <w:numId w:val="1"/>
@@ -101,7 +87,7 @@
     </w:p>
     <w:p>
       <w:pPr>
-        <w:pStyle w:val="ListParagraph"/>
+        <w:pStyle w:val="a6"/>
         <w:numPr>
           <w:ilvl w:val="0"/>
           <w:numId w:val="1"/>
@@ -119,7 +105,7 @@
     </w:p>
     <w:p>
       <w:pPr>
-        <w:pStyle w:val="ListParagraph"/>
+        <w:pStyle w:val="a6"/>
         <w:numPr>
           <w:ilvl w:val="1"/>
           <w:numId w:val="1"/>
@@ -137,7 +123,7 @@
     </w:p>
     <w:p>
       <w:pPr>
-        <w:pStyle w:val="ListParagraph"/>
+        <w:pStyle w:val="a6"/>
         <w:numPr>
           <w:ilvl w:val="0"/>
           <w:numId w:val="1"/>
@@ -155,7 +141,7 @@
     </w:p>
     <w:p>
       <w:pPr>
-        <w:pStyle w:val="ListParagraph"/>
+        <w:pStyle w:val="a6"/>
         <w:numPr>
           <w:ilvl w:val="1"/>
           <w:numId w:val="1"/>
@@ -173,7 +159,7 @@
     </w:p>
     <w:p>
       <w:pPr>
-        <w:pStyle w:val="ListParagraph"/>
+        <w:pStyle w:val="a6"/>
         <w:numPr>
           <w:ilvl w:val="0"/>
           <w:numId w:val="1"/>
@@ -186,26 +172,12 @@
         <w:rPr>
           <w:lang w:val="en-US"/>
         </w:rPr>
-        <w:t xml:space="preserve">Write </w:t>
+        <w:t>Write a read me</w:t>
       </w:r>
-      <w:proofErr w:type="gramStart"/>
-      <w:r>
-        <w:rPr>
-          <w:lang w:val="en-US"/>
-        </w:rPr>
-        <w:t>a read</w:t>
-      </w:r>
-      <w:proofErr w:type="gramEnd"/>
-      <w:r>
-        <w:rPr>
-          <w:lang w:val="en-US"/>
-        </w:rPr>
-        <w:t xml:space="preserve"> me</w:t>
-      </w:r>
-    </w:p>
-    <w:p>
-      <w:pPr>
-        <w:pStyle w:val="ListParagraph"/>
+    </w:p>
+    <w:p>
+      <w:pPr>
+        <w:pStyle w:val="a6"/>
         <w:numPr>
           <w:ilvl w:val="1"/>
           <w:numId w:val="1"/>
@@ -223,7 +195,7 @@
     </w:p>
     <w:p>
       <w:pPr>
-        <w:pStyle w:val="ListParagraph"/>
+        <w:pStyle w:val="a6"/>
         <w:numPr>
           <w:ilvl w:val="0"/>
           <w:numId w:val="1"/>
@@ -241,7 +213,7 @@
     </w:p>
     <w:p>
       <w:pPr>
-        <w:pStyle w:val="ListParagraph"/>
+        <w:pStyle w:val="a6"/>
         <w:numPr>
           <w:ilvl w:val="1"/>
           <w:numId w:val="1"/>
@@ -293,7 +265,7 @@
       <w:hyperlink r:id="rId7" w:history="1">
         <w:r>
           <w:rPr>
-            <w:rStyle w:val="Hyperlink"/>
+            <w:rStyle w:val="ac"/>
             <w:lang w:val="en-US"/>
           </w:rPr>
           <w:t>https://github.com/Tomieseatron/159251-TPahulu-NPark-Assignment1</w:t>
@@ -308,7 +280,12 @@
       </w:pPr>
     </w:p>
     <w:sectPr>
-      <w:headerReference w:type="default" r:id="rId8"/>
+      <w:headerReference w:type="even" r:id="rId8"/>
+      <w:headerReference w:type="default" r:id="rId9"/>
+      <w:footerReference w:type="even" r:id="rId10"/>
+      <w:footerReference w:type="default" r:id="rId11"/>
+      <w:headerReference w:type="first" r:id="rId12"/>
+      <w:footerReference w:type="first" r:id="rId13"/>
       <w:pgSz w:w="11906" w:h="16838"/>
       <w:pgMar w:top="1440" w:right="1440" w:bottom="1440" w:left="1440" w:header="708" w:footer="708" w:gutter="0"/>
       <w:cols w:space="708"/>
@@ -319,7 +296,7 @@
 </file>
 
 <file path=word/endnotes.xml><?xml version="1.0" encoding="utf-8"?>
-<w:endnotes xmlns:wpc="http://schemas.microsoft.com/office/word/2010/wordprocessingCanvas" xmlns:cx="http://schemas.microsoft.com/office/drawing/2014/chartex" xmlns:cx1="http://schemas.microsoft.com/office/drawing/2015/9/8/chartex" xmlns:cx2="http://schemas.microsoft.com/office/drawing/2015/10/21/chartex" xmlns:cx3="http://schemas.microsoft.com/office/drawing/2016/5/9/chartex" xmlns:cx4="http://schemas.microsoft.com/office/drawing/2016/5/10/chartex" xmlns:cx5="http://schemas.microsoft.com/office/drawing/2016/5/11/chartex" xmlns:cx6="http://schemas.microsoft.com/office/drawing/2016/5/12/chartex" xmlns:cx7="http://schemas.microsoft.com/office/drawing/2016/5/13/chartex" xmlns:cx8="http://schemas.microsoft.com/office/drawing/2016/5/14/chartex" xmlns:mc="http://schemas.openxmlformats.org/markup-compatibility/2006" xmlns:aink="http://schemas.microsoft.com/office/drawing/2016/ink" xmlns:am3d="http://schemas.microsoft.com/office/drawing/2017/model3d" xmlns:o="urn:schemas-microsoft-com:office:office" xmlns:oel="http://schemas.microsoft.com/office/2019/extlst" xmlns:r="http://schemas.openxmlformats.org/officeDocument/2006/relationships" xmlns:m="http://schemas.openxmlformats.org/officeDocument/2006/math" xmlns:v="urn:schemas-microsoft-com:vml" xmlns:wp14="http://schemas.microsoft.com/office/word/2010/wordprocessingDrawing" xmlns:wp="http://schemas.openxmlformats.org/drawingml/2006/wordprocessingDrawing" xmlns:w10="urn:schemas-microsoft-com:office:word" xmlns:w="http://schemas.openxmlformats.org/wordprocessingml/2006/main" xmlns:w14="http://schemas.microsoft.com/office/word/2010/wordml" xmlns:w15="http://schemas.microsoft.com/office/word/2012/wordml" xmlns:w16cei="http://schemas.microsoft.com/office/word/2026/wordml/cei" xmlns:w16cex="http://schemas.microsoft.com/office/word/2018/wordml/cex" xmlns:w16cid="http://schemas.microsoft.com/office/word/2016/wordml/cid" xmlns:w16="http://schemas.microsoft.com/office/word/2018/wordml" xmlns:w16du="http://schemas.microsoft.com/office/word/2023/wordml/word16du" xmlns:w16sdtdh="http://schemas.microsoft.com/office/word/2020/wordml/sdtdatahash" xmlns:w16sdtfl="http://schemas.microsoft.com/office/word/2024/wordml/sdtformatlock" xmlns:w16se="http://schemas.microsoft.com/office/word/2015/wordml/symex" xmlns:wpg="http://schemas.microsoft.com/office/word/2010/wordprocessingGroup" xmlns:wpi="http://schemas.microsoft.com/office/word/2010/wordprocessingInk" xmlns:wne="http://schemas.microsoft.com/office/word/2006/wordml" xmlns:wps="http://schemas.microsoft.com/office/word/2010/wordprocessingShape" mc:Ignorable="w14 w15 w16se w16cid w16 w16cex w16sdtdh w16sdtfl w16du wp14">
+<w:endnotes xmlns:wpc="http://schemas.microsoft.com/office/word/2010/wordprocessingCanvas" xmlns:cx="http://schemas.microsoft.com/office/drawing/2014/chartex" xmlns:cx1="http://schemas.microsoft.com/office/drawing/2015/9/8/chartex" xmlns:cx2="http://schemas.microsoft.com/office/drawing/2015/10/21/chartex" xmlns:cx3="http://schemas.microsoft.com/office/drawing/2016/5/9/chartex" xmlns:cx4="http://schemas.microsoft.com/office/drawing/2016/5/10/chartex" xmlns:cx5="http://schemas.microsoft.com/office/drawing/2016/5/11/chartex" xmlns:cx6="http://schemas.microsoft.com/office/drawing/2016/5/12/chartex" xmlns:cx7="http://schemas.microsoft.com/office/drawing/2016/5/13/chartex" xmlns:cx8="http://schemas.microsoft.com/office/drawing/2016/5/14/chartex" xmlns:mc="http://schemas.openxmlformats.org/markup-compatibility/2006" xmlns:aink="http://schemas.microsoft.com/office/drawing/2016/ink" xmlns:am3d="http://schemas.microsoft.com/office/drawing/2017/model3d" xmlns:o="urn:schemas-microsoft-com:office:office" xmlns:r="http://schemas.openxmlformats.org/officeDocument/2006/relationships" xmlns:m="http://schemas.openxmlformats.org/officeDocument/2006/math" xmlns:v="urn:schemas-microsoft-com:vml" xmlns:wp14="http://schemas.microsoft.com/office/word/2010/wordprocessingDrawing" xmlns:wp="http://schemas.openxmlformats.org/drawingml/2006/wordprocessingDrawing" xmlns:w10="urn:schemas-microsoft-com:office:word" xmlns:w="http://schemas.openxmlformats.org/wordprocessingml/2006/main" xmlns:w14="http://schemas.microsoft.com/office/word/2010/wordml" xmlns:w15="http://schemas.microsoft.com/office/word/2012/wordml" xmlns:w16cex="http://schemas.microsoft.com/office/word/2018/wordml/cex" xmlns:w16cid="http://schemas.microsoft.com/office/word/2016/wordml/cid" xmlns:w16="http://schemas.microsoft.com/office/word/2018/wordml" xmlns:w16sdtdh="http://schemas.microsoft.com/office/word/2020/wordml/sdtdatahash" xmlns:w16se="http://schemas.microsoft.com/office/word/2015/wordml/symex" xmlns:wpg="http://schemas.microsoft.com/office/word/2010/wordprocessingGroup" xmlns:wpi="http://schemas.microsoft.com/office/word/2010/wordprocessingInk" xmlns:wne="http://schemas.microsoft.com/office/word/2006/wordml" xmlns:wps="http://schemas.microsoft.com/office/word/2010/wordprocessingShape" mc:Ignorable="w14 w15 w16se w16cid w16 w16cex w16sdtdh wp14">
   <w:endnote w:type="separator" w:id="-1">
     <w:p>
       <w:pPr>
@@ -343,8 +320,38 @@
 </w:endnotes>
 </file>
 
+<file path=word/footer1.xml><?xml version="1.0" encoding="utf-8"?>
+<w:ftr xmlns:wpc="http://schemas.microsoft.com/office/word/2010/wordprocessingCanvas" xmlns:cx="http://schemas.microsoft.com/office/drawing/2014/chartex" xmlns:cx1="http://schemas.microsoft.com/office/drawing/2015/9/8/chartex" xmlns:cx2="http://schemas.microsoft.com/office/drawing/2015/10/21/chartex" xmlns:cx3="http://schemas.microsoft.com/office/drawing/2016/5/9/chartex" xmlns:cx4="http://schemas.microsoft.com/office/drawing/2016/5/10/chartex" xmlns:cx5="http://schemas.microsoft.com/office/drawing/2016/5/11/chartex" xmlns:cx6="http://schemas.microsoft.com/office/drawing/2016/5/12/chartex" xmlns:cx7="http://schemas.microsoft.com/office/drawing/2016/5/13/chartex" xmlns:cx8="http://schemas.microsoft.com/office/drawing/2016/5/14/chartex" xmlns:mc="http://schemas.openxmlformats.org/markup-compatibility/2006" xmlns:aink="http://schemas.microsoft.com/office/drawing/2016/ink" xmlns:am3d="http://schemas.microsoft.com/office/drawing/2017/model3d" xmlns:o="urn:schemas-microsoft-com:office:office" xmlns:r="http://schemas.openxmlformats.org/officeDocument/2006/relationships" xmlns:m="http://schemas.openxmlformats.org/officeDocument/2006/math" xmlns:v="urn:schemas-microsoft-com:vml" xmlns:wp14="http://schemas.microsoft.com/office/word/2010/wordprocessingDrawing" xmlns:wp="http://schemas.openxmlformats.org/drawingml/2006/wordprocessingDrawing" xmlns:w10="urn:schemas-microsoft-com:office:word" xmlns:w="http://schemas.openxmlformats.org/wordprocessingml/2006/main" xmlns:w14="http://schemas.microsoft.com/office/word/2010/wordml" xmlns:w15="http://schemas.microsoft.com/office/word/2012/wordml" xmlns:w16cex="http://schemas.microsoft.com/office/word/2018/wordml/cex" xmlns:w16cid="http://schemas.microsoft.com/office/word/2016/wordml/cid" xmlns:w16="http://schemas.microsoft.com/office/word/2018/wordml" xmlns:w16sdtdh="http://schemas.microsoft.com/office/word/2020/wordml/sdtdatahash" xmlns:w16se="http://schemas.microsoft.com/office/word/2015/wordml/symex" xmlns:wpg="http://schemas.microsoft.com/office/word/2010/wordprocessingGroup" xmlns:wpi="http://schemas.microsoft.com/office/word/2010/wordprocessingInk" xmlns:wne="http://schemas.microsoft.com/office/word/2006/wordml" xmlns:wps="http://schemas.microsoft.com/office/word/2010/wordprocessingShape" mc:Ignorable="w14 w15 w16se w16cid w16 w16cex w16sdtdh wp14">
+  <w:p>
+    <w:pPr>
+      <w:pStyle w:val="ab"/>
+    </w:pPr>
+  </w:p>
+</w:ftr>
+</file>
+
+<file path=word/footer2.xml><?xml version="1.0" encoding="utf-8"?>
+<w:ftr xmlns:wpc="http://schemas.microsoft.com/office/word/2010/wordprocessingCanvas" xmlns:cx="http://schemas.microsoft.com/office/drawing/2014/chartex" xmlns:cx1="http://schemas.microsoft.com/office/drawing/2015/9/8/chartex" xmlns:cx2="http://schemas.microsoft.com/office/drawing/2015/10/21/chartex" xmlns:cx3="http://schemas.microsoft.com/office/drawing/2016/5/9/chartex" xmlns:cx4="http://schemas.microsoft.com/office/drawing/2016/5/10/chartex" xmlns:cx5="http://schemas.microsoft.com/office/drawing/2016/5/11/chartex" xmlns:cx6="http://schemas.microsoft.com/office/drawing/2016/5/12/chartex" xmlns:cx7="http://schemas.microsoft.com/office/drawing/2016/5/13/chartex" xmlns:cx8="http://schemas.microsoft.com/office/drawing/2016/5/14/chartex" xmlns:mc="http://schemas.openxmlformats.org/markup-compatibility/2006" xmlns:aink="http://schemas.microsoft.com/office/drawing/2016/ink" xmlns:am3d="http://schemas.microsoft.com/office/drawing/2017/model3d" xmlns:o="urn:schemas-microsoft-com:office:office" xmlns:r="http://schemas.openxmlformats.org/officeDocument/2006/relationships" xmlns:m="http://schemas.openxmlformats.org/officeDocument/2006/math" xmlns:v="urn:schemas-microsoft-com:vml" xmlns:wp14="http://schemas.microsoft.com/office/word/2010/wordprocessingDrawing" xmlns:wp="http://schemas.openxmlformats.org/drawingml/2006/wordprocessingDrawing" xmlns:w10="urn:schemas-microsoft-com:office:word" xmlns:w="http://schemas.openxmlformats.org/wordprocessingml/2006/main" xmlns:w14="http://schemas.microsoft.com/office/word/2010/wordml" xmlns:w15="http://schemas.microsoft.com/office/word/2012/wordml" xmlns:w16cex="http://schemas.microsoft.com/office/word/2018/wordml/cex" xmlns:w16cid="http://schemas.microsoft.com/office/word/2016/wordml/cid" xmlns:w16="http://schemas.microsoft.com/office/word/2018/wordml" xmlns:w16sdtdh="http://schemas.microsoft.com/office/word/2020/wordml/sdtdatahash" xmlns:w16se="http://schemas.microsoft.com/office/word/2015/wordml/symex" xmlns:wpg="http://schemas.microsoft.com/office/word/2010/wordprocessingGroup" xmlns:wpi="http://schemas.microsoft.com/office/word/2010/wordprocessingInk" xmlns:wne="http://schemas.microsoft.com/office/word/2006/wordml" xmlns:wps="http://schemas.microsoft.com/office/word/2010/wordprocessingShape" mc:Ignorable="w14 w15 w16se w16cid w16 w16cex w16sdtdh wp14">
+  <w:p>
+    <w:pPr>
+      <w:pStyle w:val="ab"/>
+    </w:pPr>
+  </w:p>
+</w:ftr>
+</file>
+
+<file path=word/footer3.xml><?xml version="1.0" encoding="utf-8"?>
+<w:ftr xmlns:wpc="http://schemas.microsoft.com/office/word/2010/wordprocessingCanvas" xmlns:cx="http://schemas.microsoft.com/office/drawing/2014/chartex" xmlns:cx1="http://schemas.microsoft.com/office/drawing/2015/9/8/chartex" xmlns:cx2="http://schemas.microsoft.com/office/drawing/2015/10/21/chartex" xmlns:cx3="http://schemas.microsoft.com/office/drawing/2016/5/9/chartex" xmlns:cx4="http://schemas.microsoft.com/office/drawing/2016/5/10/chartex" xmlns:cx5="http://schemas.microsoft.com/office/drawing/2016/5/11/chartex" xmlns:cx6="http://schemas.microsoft.com/office/drawing/2016/5/12/chartex" xmlns:cx7="http://schemas.microsoft.com/office/drawing/2016/5/13/chartex" xmlns:cx8="http://schemas.microsoft.com/office/drawing/2016/5/14/chartex" xmlns:mc="http://schemas.openxmlformats.org/markup-compatibility/2006" xmlns:aink="http://schemas.microsoft.com/office/drawing/2016/ink" xmlns:am3d="http://schemas.microsoft.com/office/drawing/2017/model3d" xmlns:o="urn:schemas-microsoft-com:office:office" xmlns:r="http://schemas.openxmlformats.org/officeDocument/2006/relationships" xmlns:m="http://schemas.openxmlformats.org/officeDocument/2006/math" xmlns:v="urn:schemas-microsoft-com:vml" xmlns:wp14="http://schemas.microsoft.com/office/word/2010/wordprocessingDrawing" xmlns:wp="http://schemas.openxmlformats.org/drawingml/2006/wordprocessingDrawing" xmlns:w10="urn:schemas-microsoft-com:office:word" xmlns:w="http://schemas.openxmlformats.org/wordprocessingml/2006/main" xmlns:w14="http://schemas.microsoft.com/office/word/2010/wordml" xmlns:w15="http://schemas.microsoft.com/office/word/2012/wordml" xmlns:w16cex="http://schemas.microsoft.com/office/word/2018/wordml/cex" xmlns:w16cid="http://schemas.microsoft.com/office/word/2016/wordml/cid" xmlns:w16="http://schemas.microsoft.com/office/word/2018/wordml" xmlns:w16sdtdh="http://schemas.microsoft.com/office/word/2020/wordml/sdtdatahash" xmlns:w16se="http://schemas.microsoft.com/office/word/2015/wordml/symex" xmlns:wpg="http://schemas.microsoft.com/office/word/2010/wordprocessingGroup" xmlns:wpi="http://schemas.microsoft.com/office/word/2010/wordprocessingInk" xmlns:wne="http://schemas.microsoft.com/office/word/2006/wordml" xmlns:wps="http://schemas.microsoft.com/office/word/2010/wordprocessingShape" mc:Ignorable="w14 w15 w16se w16cid w16 w16cex w16sdtdh wp14">
+  <w:p>
+    <w:pPr>
+      <w:pStyle w:val="ab"/>
+    </w:pPr>
+  </w:p>
+</w:ftr>
+</file>
+
 <file path=word/footnotes.xml><?xml version="1.0" encoding="utf-8"?>
-<w:footnotes xmlns:wpc="http://schemas.microsoft.com/office/word/2010/wordprocessingCanvas" xmlns:cx="http://schemas.microsoft.com/office/drawing/2014/chartex" xmlns:cx1="http://schemas.microsoft.com/office/drawing/2015/9/8/chartex" xmlns:cx2="http://schemas.microsoft.com/office/drawing/2015/10/21/chartex" xmlns:cx3="http://schemas.microsoft.com/office/drawing/2016/5/9/chartex" xmlns:cx4="http://schemas.microsoft.com/office/drawing/2016/5/10/chartex" xmlns:cx5="http://schemas.microsoft.com/office/drawing/2016/5/11/chartex" xmlns:cx6="http://schemas.microsoft.com/office/drawing/2016/5/12/chartex" xmlns:cx7="http://schemas.microsoft.com/office/drawing/2016/5/13/chartex" xmlns:cx8="http://schemas.microsoft.com/office/drawing/2016/5/14/chartex" xmlns:mc="http://schemas.openxmlformats.org/markup-compatibility/2006" xmlns:aink="http://schemas.microsoft.com/office/drawing/2016/ink" xmlns:am3d="http://schemas.microsoft.com/office/drawing/2017/model3d" xmlns:o="urn:schemas-microsoft-com:office:office" xmlns:oel="http://schemas.microsoft.com/office/2019/extlst" xmlns:r="http://schemas.openxmlformats.org/officeDocument/2006/relationships" xmlns:m="http://schemas.openxmlformats.org/officeDocument/2006/math" xmlns:v="urn:schemas-microsoft-com:vml" xmlns:wp14="http://schemas.microsoft.com/office/word/2010/wordprocessingDrawing" xmlns:wp="http://schemas.openxmlformats.org/drawingml/2006/wordprocessingDrawing" xmlns:w10="urn:schemas-microsoft-com:office:word" xmlns:w="http://schemas.openxmlformats.org/wordprocessingml/2006/main" xmlns:w14="http://schemas.microsoft.com/office/word/2010/wordml" xmlns:w15="http://schemas.microsoft.com/office/word/2012/wordml" xmlns:w16cei="http://schemas.microsoft.com/office/word/2026/wordml/cei" xmlns:w16cex="http://schemas.microsoft.com/office/word/2018/wordml/cex" xmlns:w16cid="http://schemas.microsoft.com/office/word/2016/wordml/cid" xmlns:w16="http://schemas.microsoft.com/office/word/2018/wordml" xmlns:w16du="http://schemas.microsoft.com/office/word/2023/wordml/word16du" xmlns:w16sdtdh="http://schemas.microsoft.com/office/word/2020/wordml/sdtdatahash" xmlns:w16sdtfl="http://schemas.microsoft.com/office/word/2024/wordml/sdtformatlock" xmlns:w16se="http://schemas.microsoft.com/office/word/2015/wordml/symex" xmlns:wpg="http://schemas.microsoft.com/office/word/2010/wordprocessingGroup" xmlns:wpi="http://schemas.microsoft.com/office/word/2010/wordprocessingInk" xmlns:wne="http://schemas.microsoft.com/office/word/2006/wordml" xmlns:wps="http://schemas.microsoft.com/office/word/2010/wordprocessingShape" mc:Ignorable="w14 w15 w16se w16cid w16 w16cex w16sdtdh w16sdtfl w16du wp14">
+<w:footnotes xmlns:wpc="http://schemas.microsoft.com/office/word/2010/wordprocessingCanvas" xmlns:cx="http://schemas.microsoft.com/office/drawing/2014/chartex" xmlns:cx1="http://schemas.microsoft.com/office/drawing/2015/9/8/chartex" xmlns:cx2="http://schemas.microsoft.com/office/drawing/2015/10/21/chartex" xmlns:cx3="http://schemas.microsoft.com/office/drawing/2016/5/9/chartex" xmlns:cx4="http://schemas.microsoft.com/office/drawing/2016/5/10/chartex" xmlns:cx5="http://schemas.microsoft.com/office/drawing/2016/5/11/chartex" xmlns:cx6="http://schemas.microsoft.com/office/drawing/2016/5/12/chartex" xmlns:cx7="http://schemas.microsoft.com/office/drawing/2016/5/13/chartex" xmlns:cx8="http://schemas.microsoft.com/office/drawing/2016/5/14/chartex" xmlns:mc="http://schemas.openxmlformats.org/markup-compatibility/2006" xmlns:aink="http://schemas.microsoft.com/office/drawing/2016/ink" xmlns:am3d="http://schemas.microsoft.com/office/drawing/2017/model3d" xmlns:o="urn:schemas-microsoft-com:office:office" xmlns:r="http://schemas.openxmlformats.org/officeDocument/2006/relationships" xmlns:m="http://schemas.openxmlformats.org/officeDocument/2006/math" xmlns:v="urn:schemas-microsoft-com:vml" xmlns:wp14="http://schemas.microsoft.com/office/word/2010/wordprocessingDrawing" xmlns:wp="http://schemas.openxmlformats.org/drawingml/2006/wordprocessingDrawing" xmlns:w10="urn:schemas-microsoft-com:office:word" xmlns:w="http://schemas.openxmlformats.org/wordprocessingml/2006/main" xmlns:w14="http://schemas.microsoft.com/office/word/2010/wordml" xmlns:w15="http://schemas.microsoft.com/office/word/2012/wordml" xmlns:w16cex="http://schemas.microsoft.com/office/word/2018/wordml/cex" xmlns:w16cid="http://schemas.microsoft.com/office/word/2016/wordml/cid" xmlns:w16="http://schemas.microsoft.com/office/word/2018/wordml" xmlns:w16sdtdh="http://schemas.microsoft.com/office/word/2020/wordml/sdtdatahash" xmlns:w16se="http://schemas.microsoft.com/office/word/2015/wordml/symex" xmlns:wpg="http://schemas.microsoft.com/office/word/2010/wordprocessingGroup" xmlns:wpi="http://schemas.microsoft.com/office/word/2010/wordprocessingInk" xmlns:wne="http://schemas.microsoft.com/office/word/2006/wordml" xmlns:wps="http://schemas.microsoft.com/office/word/2010/wordprocessingShape" mc:Ignorable="w14 w15 w16se w16cid w16 w16cex w16sdtdh wp14">
   <w:footnote w:type="separator" w:id="-1">
     <w:p>
       <w:pPr>
@@ -369,10 +376,20 @@
 </file>
 
 <file path=word/header1.xml><?xml version="1.0" encoding="utf-8"?>
-<w:hdr xmlns:wpc="http://schemas.microsoft.com/office/word/2010/wordprocessingCanvas" xmlns:cx="http://schemas.microsoft.com/office/drawing/2014/chartex" xmlns:cx1="http://schemas.microsoft.com/office/drawing/2015/9/8/chartex" xmlns:cx2="http://schemas.microsoft.com/office/drawing/2015/10/21/chartex" xmlns:cx3="http://schemas.microsoft.com/office/drawing/2016/5/9/chartex" xmlns:cx4="http://schemas.microsoft.com/office/drawing/2016/5/10/chartex" xmlns:cx5="http://schemas.microsoft.com/office/drawing/2016/5/11/chartex" xmlns:cx6="http://schemas.microsoft.com/office/drawing/2016/5/12/chartex" xmlns:cx7="http://schemas.microsoft.com/office/drawing/2016/5/13/chartex" xmlns:cx8="http://schemas.microsoft.com/office/drawing/2016/5/14/chartex" xmlns:mc="http://schemas.openxmlformats.org/markup-compatibility/2006" xmlns:aink="http://schemas.microsoft.com/office/drawing/2016/ink" xmlns:am3d="http://schemas.microsoft.com/office/drawing/2017/model3d" xmlns:o="urn:schemas-microsoft-com:office:office" xmlns:oel="http://schemas.microsoft.com/office/2019/extlst" xmlns:r="http://schemas.openxmlformats.org/officeDocument/2006/relationships" xmlns:m="http://schemas.openxmlformats.org/officeDocument/2006/math" xmlns:v="urn:schemas-microsoft-com:vml" xmlns:wp14="http://schemas.microsoft.com/office/word/2010/wordprocessingDrawing" xmlns:wp="http://schemas.openxmlformats.org/drawingml/2006/wordprocessingDrawing" xmlns:w10="urn:schemas-microsoft-com:office:word" xmlns:w="http://schemas.openxmlformats.org/wordprocessingml/2006/main" xmlns:w14="http://schemas.microsoft.com/office/word/2010/wordml" xmlns:w15="http://schemas.microsoft.com/office/word/2012/wordml" xmlns:w16cei="http://schemas.microsoft.com/office/word/2026/wordml/cei" xmlns:w16cex="http://schemas.microsoft.com/office/word/2018/wordml/cex" xmlns:w16cid="http://schemas.microsoft.com/office/word/2016/wordml/cid" xmlns:w16="http://schemas.microsoft.com/office/word/2018/wordml" xmlns:w16du="http://schemas.microsoft.com/office/word/2023/wordml/word16du" xmlns:w16sdtdh="http://schemas.microsoft.com/office/word/2020/wordml/sdtdatahash" xmlns:w16sdtfl="http://schemas.microsoft.com/office/word/2024/wordml/sdtformatlock" xmlns:w16se="http://schemas.microsoft.com/office/word/2015/wordml/symex" xmlns:wpg="http://schemas.microsoft.com/office/word/2010/wordprocessingGroup" xmlns:wpi="http://schemas.microsoft.com/office/word/2010/wordprocessingInk" xmlns:wne="http://schemas.microsoft.com/office/word/2006/wordml" xmlns:wps="http://schemas.microsoft.com/office/word/2010/wordprocessingShape" mc:Ignorable="w14 w15 w16se w16cid w16 w16cex w16sdtdh w16sdtfl w16du wp14">
+<w:hdr xmlns:wpc="http://schemas.microsoft.com/office/word/2010/wordprocessingCanvas" xmlns:cx="http://schemas.microsoft.com/office/drawing/2014/chartex" xmlns:cx1="http://schemas.microsoft.com/office/drawing/2015/9/8/chartex" xmlns:cx2="http://schemas.microsoft.com/office/drawing/2015/10/21/chartex" xmlns:cx3="http://schemas.microsoft.com/office/drawing/2016/5/9/chartex" xmlns:cx4="http://schemas.microsoft.com/office/drawing/2016/5/10/chartex" xmlns:cx5="http://schemas.microsoft.com/office/drawing/2016/5/11/chartex" xmlns:cx6="http://schemas.microsoft.com/office/drawing/2016/5/12/chartex" xmlns:cx7="http://schemas.microsoft.com/office/drawing/2016/5/13/chartex" xmlns:cx8="http://schemas.microsoft.com/office/drawing/2016/5/14/chartex" xmlns:mc="http://schemas.openxmlformats.org/markup-compatibility/2006" xmlns:aink="http://schemas.microsoft.com/office/drawing/2016/ink" xmlns:am3d="http://schemas.microsoft.com/office/drawing/2017/model3d" xmlns:o="urn:schemas-microsoft-com:office:office" xmlns:r="http://schemas.openxmlformats.org/officeDocument/2006/relationships" xmlns:m="http://schemas.openxmlformats.org/officeDocument/2006/math" xmlns:v="urn:schemas-microsoft-com:vml" xmlns:wp14="http://schemas.microsoft.com/office/word/2010/wordprocessingDrawing" xmlns:wp="http://schemas.openxmlformats.org/drawingml/2006/wordprocessingDrawing" xmlns:w10="urn:schemas-microsoft-com:office:word" xmlns:w="http://schemas.openxmlformats.org/wordprocessingml/2006/main" xmlns:w14="http://schemas.microsoft.com/office/word/2010/wordml" xmlns:w15="http://schemas.microsoft.com/office/word/2012/wordml" xmlns:w16cex="http://schemas.microsoft.com/office/word/2018/wordml/cex" xmlns:w16cid="http://schemas.microsoft.com/office/word/2016/wordml/cid" xmlns:w16="http://schemas.microsoft.com/office/word/2018/wordml" xmlns:w16sdtdh="http://schemas.microsoft.com/office/word/2020/wordml/sdtdatahash" xmlns:w16se="http://schemas.microsoft.com/office/word/2015/wordml/symex" xmlns:wpg="http://schemas.microsoft.com/office/word/2010/wordprocessingGroup" xmlns:wpi="http://schemas.microsoft.com/office/word/2010/wordprocessingInk" xmlns:wne="http://schemas.microsoft.com/office/word/2006/wordml" xmlns:wps="http://schemas.microsoft.com/office/word/2010/wordprocessingShape" mc:Ignorable="w14 w15 w16se w16cid w16 w16cex w16sdtdh wp14">
   <w:p>
     <w:pPr>
-      <w:pStyle w:val="Header"/>
+      <w:pStyle w:val="aa"/>
+    </w:pPr>
+  </w:p>
+</w:hdr>
+</file>
+
+<file path=word/header2.xml><?xml version="1.0" encoding="utf-8"?>
+<w:hdr xmlns:wpc="http://schemas.microsoft.com/office/word/2010/wordprocessingCanvas" xmlns:cx="http://schemas.microsoft.com/office/drawing/2014/chartex" xmlns:cx1="http://schemas.microsoft.com/office/drawing/2015/9/8/chartex" xmlns:cx2="http://schemas.microsoft.com/office/drawing/2015/10/21/chartex" xmlns:cx3="http://schemas.microsoft.com/office/drawing/2016/5/9/chartex" xmlns:cx4="http://schemas.microsoft.com/office/drawing/2016/5/10/chartex" xmlns:cx5="http://schemas.microsoft.com/office/drawing/2016/5/11/chartex" xmlns:cx6="http://schemas.microsoft.com/office/drawing/2016/5/12/chartex" xmlns:cx7="http://schemas.microsoft.com/office/drawing/2016/5/13/chartex" xmlns:cx8="http://schemas.microsoft.com/office/drawing/2016/5/14/chartex" xmlns:mc="http://schemas.openxmlformats.org/markup-compatibility/2006" xmlns:aink="http://schemas.microsoft.com/office/drawing/2016/ink" xmlns:am3d="http://schemas.microsoft.com/office/drawing/2017/model3d" xmlns:o="urn:schemas-microsoft-com:office:office" xmlns:r="http://schemas.openxmlformats.org/officeDocument/2006/relationships" xmlns:m="http://schemas.openxmlformats.org/officeDocument/2006/math" xmlns:v="urn:schemas-microsoft-com:vml" xmlns:wp14="http://schemas.microsoft.com/office/word/2010/wordprocessingDrawing" xmlns:wp="http://schemas.openxmlformats.org/drawingml/2006/wordprocessingDrawing" xmlns:w10="urn:schemas-microsoft-com:office:word" xmlns:w="http://schemas.openxmlformats.org/wordprocessingml/2006/main" xmlns:w14="http://schemas.microsoft.com/office/word/2010/wordml" xmlns:w15="http://schemas.microsoft.com/office/word/2012/wordml" xmlns:w16cex="http://schemas.microsoft.com/office/word/2018/wordml/cex" xmlns:w16cid="http://schemas.microsoft.com/office/word/2016/wordml/cid" xmlns:w16="http://schemas.microsoft.com/office/word/2018/wordml" xmlns:w16sdtdh="http://schemas.microsoft.com/office/word/2020/wordml/sdtdatahash" xmlns:w16se="http://schemas.microsoft.com/office/word/2015/wordml/symex" xmlns:wpg="http://schemas.microsoft.com/office/word/2010/wordprocessingGroup" xmlns:wpi="http://schemas.microsoft.com/office/word/2010/wordprocessingInk" xmlns:wne="http://schemas.microsoft.com/office/word/2006/wordml" xmlns:wps="http://schemas.microsoft.com/office/word/2010/wordprocessingShape" mc:Ignorable="w14 w15 w16se w16cid w16 w16cex w16sdtdh wp14">
+  <w:p>
+    <w:pPr>
+      <w:pStyle w:val="aa"/>
       <w:rPr>
         <w:lang w:val="en-US"/>
       </w:rPr>
@@ -402,7 +419,7 @@
         <w:iCs/>
         <w:lang w:val="en-US"/>
       </w:rPr>
-      <w:t>Add your Student ID here</w:t>
+      <w:t>25020271</w:t>
     </w:r>
     <w:r>
       <w:rPr>
@@ -424,8 +441,18 @@
 </w:hdr>
 </file>
 
+<file path=word/header3.xml><?xml version="1.0" encoding="utf-8"?>
+<w:hdr xmlns:wpc="http://schemas.microsoft.com/office/word/2010/wordprocessingCanvas" xmlns:cx="http://schemas.microsoft.com/office/drawing/2014/chartex" xmlns:cx1="http://schemas.microsoft.com/office/drawing/2015/9/8/chartex" xmlns:cx2="http://schemas.microsoft.com/office/drawing/2015/10/21/chartex" xmlns:cx3="http://schemas.microsoft.com/office/drawing/2016/5/9/chartex" xmlns:cx4="http://schemas.microsoft.com/office/drawing/2016/5/10/chartex" xmlns:cx5="http://schemas.microsoft.com/office/drawing/2016/5/11/chartex" xmlns:cx6="http://schemas.microsoft.com/office/drawing/2016/5/12/chartex" xmlns:cx7="http://schemas.microsoft.com/office/drawing/2016/5/13/chartex" xmlns:cx8="http://schemas.microsoft.com/office/drawing/2016/5/14/chartex" xmlns:mc="http://schemas.openxmlformats.org/markup-compatibility/2006" xmlns:aink="http://schemas.microsoft.com/office/drawing/2016/ink" xmlns:am3d="http://schemas.microsoft.com/office/drawing/2017/model3d" xmlns:o="urn:schemas-microsoft-com:office:office" xmlns:r="http://schemas.openxmlformats.org/officeDocument/2006/relationships" xmlns:m="http://schemas.openxmlformats.org/officeDocument/2006/math" xmlns:v="urn:schemas-microsoft-com:vml" xmlns:wp14="http://schemas.microsoft.com/office/word/2010/wordprocessingDrawing" xmlns:wp="http://schemas.openxmlformats.org/drawingml/2006/wordprocessingDrawing" xmlns:w10="urn:schemas-microsoft-com:office:word" xmlns:w="http://schemas.openxmlformats.org/wordprocessingml/2006/main" xmlns:w14="http://schemas.microsoft.com/office/word/2010/wordml" xmlns:w15="http://schemas.microsoft.com/office/word/2012/wordml" xmlns:w16cex="http://schemas.microsoft.com/office/word/2018/wordml/cex" xmlns:w16cid="http://schemas.microsoft.com/office/word/2016/wordml/cid" xmlns:w16="http://schemas.microsoft.com/office/word/2018/wordml" xmlns:w16sdtdh="http://schemas.microsoft.com/office/word/2020/wordml/sdtdatahash" xmlns:w16se="http://schemas.microsoft.com/office/word/2015/wordml/symex" xmlns:wpg="http://schemas.microsoft.com/office/word/2010/wordprocessingGroup" xmlns:wpi="http://schemas.microsoft.com/office/word/2010/wordprocessingInk" xmlns:wne="http://schemas.microsoft.com/office/word/2006/wordml" xmlns:wps="http://schemas.microsoft.com/office/word/2010/wordprocessingShape" mc:Ignorable="w14 w15 w16se w16cid w16 w16cex w16sdtdh wp14">
+  <w:p>
+    <w:pPr>
+      <w:pStyle w:val="aa"/>
+    </w:pPr>
+  </w:p>
+</w:hdr>
+</file>
+
 <file path=word/numbering.xml><?xml version="1.0" encoding="utf-8"?>
-<w:numbering xmlns:wpc="http://schemas.microsoft.com/office/word/2010/wordprocessingCanvas" xmlns:cx="http://schemas.microsoft.com/office/drawing/2014/chartex" xmlns:cx1="http://schemas.microsoft.com/office/drawing/2015/9/8/chartex" xmlns:cx2="http://schemas.microsoft.com/office/drawing/2015/10/21/chartex" xmlns:cx3="http://schemas.microsoft.com/office/drawing/2016/5/9/chartex" xmlns:cx4="http://schemas.microsoft.com/office/drawing/2016/5/10/chartex" xmlns:cx5="http://schemas.microsoft.com/office/drawing/2016/5/11/chartex" xmlns:cx6="http://schemas.microsoft.com/office/drawing/2016/5/12/chartex" xmlns:cx7="http://schemas.microsoft.com/office/drawing/2016/5/13/chartex" xmlns:cx8="http://schemas.microsoft.com/office/drawing/2016/5/14/chartex" xmlns:mc="http://schemas.openxmlformats.org/markup-compatibility/2006" xmlns:aink="http://schemas.microsoft.com/office/drawing/2016/ink" xmlns:am3d="http://schemas.microsoft.com/office/drawing/2017/model3d" xmlns:o="urn:schemas-microsoft-com:office:office" xmlns:oel="http://schemas.microsoft.com/office/2019/extlst" xmlns:r="http://schemas.openxmlformats.org/officeDocument/2006/relationships" xmlns:m="http://schemas.openxmlformats.org/officeDocument/2006/math" xmlns:v="urn:schemas-microsoft-com:vml" xmlns:wp14="http://schemas.microsoft.com/office/word/2010/wordprocessingDrawing" xmlns:wp="http://schemas.openxmlformats.org/drawingml/2006/wordprocessingDrawing" xmlns:w10="urn:schemas-microsoft-com:office:word" xmlns:w="http://schemas.openxmlformats.org/wordprocessingml/2006/main" xmlns:w14="http://schemas.microsoft.com/office/word/2010/wordml" xmlns:w15="http://schemas.microsoft.com/office/word/2012/wordml" xmlns:w16cei="http://schemas.microsoft.com/office/word/2026/wordml/cei" xmlns:w16cex="http://schemas.microsoft.com/office/word/2018/wordml/cex" xmlns:w16cid="http://schemas.microsoft.com/office/word/2016/wordml/cid" xmlns:w16="http://schemas.microsoft.com/office/word/2018/wordml" xmlns:w16du="http://schemas.microsoft.com/office/word/2023/wordml/word16du" xmlns:w16sdtdh="http://schemas.microsoft.com/office/word/2020/wordml/sdtdatahash" xmlns:w16sdtfl="http://schemas.microsoft.com/office/word/2024/wordml/sdtformatlock" xmlns:w16se="http://schemas.microsoft.com/office/word/2015/wordml/symex" xmlns:wpg="http://schemas.microsoft.com/office/word/2010/wordprocessingGroup" xmlns:wpi="http://schemas.microsoft.com/office/word/2010/wordprocessingInk" xmlns:wne="http://schemas.microsoft.com/office/word/2006/wordml" xmlns:wps="http://schemas.microsoft.com/office/word/2010/wordprocessingShape" mc:Ignorable="w14 w15 w16se w16cid w16 w16cex w16sdtdh w16sdtfl w16du wp14">
+<w:numbering xmlns:wpc="http://schemas.microsoft.com/office/word/2010/wordprocessingCanvas" xmlns:cx="http://schemas.microsoft.com/office/drawing/2014/chartex" xmlns:cx1="http://schemas.microsoft.com/office/drawing/2015/9/8/chartex" xmlns:cx2="http://schemas.microsoft.com/office/drawing/2015/10/21/chartex" xmlns:cx3="http://schemas.microsoft.com/office/drawing/2016/5/9/chartex" xmlns:cx4="http://schemas.microsoft.com/office/drawing/2016/5/10/chartex" xmlns:cx5="http://schemas.microsoft.com/office/drawing/2016/5/11/chartex" xmlns:cx6="http://schemas.microsoft.com/office/drawing/2016/5/12/chartex" xmlns:cx7="http://schemas.microsoft.com/office/drawing/2016/5/13/chartex" xmlns:cx8="http://schemas.microsoft.com/office/drawing/2016/5/14/chartex" xmlns:mc="http://schemas.openxmlformats.org/markup-compatibility/2006" xmlns:aink="http://schemas.microsoft.com/office/drawing/2016/ink" xmlns:am3d="http://schemas.microsoft.com/office/drawing/2017/model3d" xmlns:o="urn:schemas-microsoft-com:office:office" xmlns:r="http://schemas.openxmlformats.org/officeDocument/2006/relationships" xmlns:m="http://schemas.openxmlformats.org/officeDocument/2006/math" xmlns:v="urn:schemas-microsoft-com:vml" xmlns:wp14="http://schemas.microsoft.com/office/word/2010/wordprocessingDrawing" xmlns:wp="http://schemas.openxmlformats.org/drawingml/2006/wordprocessingDrawing" xmlns:w10="urn:schemas-microsoft-com:office:word" xmlns:w="http://schemas.openxmlformats.org/wordprocessingml/2006/main" xmlns:w14="http://schemas.microsoft.com/office/word/2010/wordml" xmlns:w15="http://schemas.microsoft.com/office/word/2012/wordml" xmlns:w16cex="http://schemas.microsoft.com/office/word/2018/wordml/cex" xmlns:w16cid="http://schemas.microsoft.com/office/word/2016/wordml/cid" xmlns:w16="http://schemas.microsoft.com/office/word/2018/wordml" xmlns:w16sdtdh="http://schemas.microsoft.com/office/word/2020/wordml/sdtdatahash" xmlns:w16se="http://schemas.microsoft.com/office/word/2015/wordml/symex" xmlns:wpg="http://schemas.microsoft.com/office/word/2010/wordprocessingGroup" xmlns:wpi="http://schemas.microsoft.com/office/word/2010/wordprocessingInk" xmlns:wne="http://schemas.microsoft.com/office/word/2006/wordml" xmlns:wps="http://schemas.microsoft.com/office/word/2010/wordprocessingShape" mc:Ignorable="w14 w15 w16se w16cid w16 w16cex w16sdtdh wp14">
   <w:abstractNum w:abstractNumId="0" w15:restartNumberingAfterBreak="0">
     <w:nsid w:val="2AAF4413"/>
     <w:multiLevelType w:val="hybridMultilevel"/>
@@ -538,18 +565,18 @@
       </w:rPr>
     </w:lvl>
   </w:abstractNum>
-  <w:num w:numId="1" w16cid:durableId="272328144">
+  <w:num w:numId="1">
     <w:abstractNumId w:val="0"/>
   </w:num>
 </w:numbering>
 </file>
 
 <file path=word/styles.xml><?xml version="1.0" encoding="utf-8"?>
-<w:styles xmlns:mc="http://schemas.openxmlformats.org/markup-compatibility/2006" xmlns:r="http://schemas.openxmlformats.org/officeDocument/2006/relationships" xmlns:w="http://schemas.openxmlformats.org/wordprocessingml/2006/main" xmlns:w14="http://schemas.microsoft.com/office/word/2010/wordml" xmlns:w15="http://schemas.microsoft.com/office/word/2012/wordml" xmlns:w16cex="http://schemas.microsoft.com/office/word/2018/wordml/cex" xmlns:w16cid="http://schemas.microsoft.com/office/word/2016/wordml/cid" xmlns:w16="http://schemas.microsoft.com/office/word/2018/wordml" xmlns:w16du="http://schemas.microsoft.com/office/word/2023/wordml/word16du" xmlns:w16sdtdh="http://schemas.microsoft.com/office/word/2020/wordml/sdtdatahash" xmlns:w16sdtfl="http://schemas.microsoft.com/office/word/2024/wordml/sdtformatlock" xmlns:w16se="http://schemas.microsoft.com/office/word/2015/wordml/symex" mc:Ignorable="w14 w15 w16se w16cid w16 w16cex w16sdtdh w16sdtfl w16du">
+<w:styles xmlns:mc="http://schemas.openxmlformats.org/markup-compatibility/2006" xmlns:r="http://schemas.openxmlformats.org/officeDocument/2006/relationships" xmlns:w="http://schemas.openxmlformats.org/wordprocessingml/2006/main" xmlns:w14="http://schemas.microsoft.com/office/word/2010/wordml" xmlns:w15="http://schemas.microsoft.com/office/word/2012/wordml" xmlns:w16cex="http://schemas.microsoft.com/office/word/2018/wordml/cex" xmlns:w16cid="http://schemas.microsoft.com/office/word/2016/wordml/cid" xmlns:w16="http://schemas.microsoft.com/office/word/2018/wordml" xmlns:w16sdtdh="http://schemas.microsoft.com/office/word/2020/wordml/sdtdatahash" xmlns:w16se="http://schemas.microsoft.com/office/word/2015/wordml/symex" mc:Ignorable="w14 w15 w16se w16cid w16 w16cex w16sdtdh">
   <w:docDefaults>
     <w:rPrDefault>
       <w:rPr>
-        <w:rFonts w:asciiTheme="minorHAnsi" w:eastAsiaTheme="minorHAnsi" w:hAnsiTheme="minorHAnsi" w:cstheme="minorBidi"/>
+        <w:rFonts w:asciiTheme="minorHAnsi" w:eastAsiaTheme="minorEastAsia" w:hAnsiTheme="minorHAnsi" w:cstheme="minorBidi"/>
         <w:kern w:val="2"/>
         <w:sz w:val="24"/>
         <w:szCs w:val="24"/>
@@ -941,15 +968,15 @@
     <w:lsdException w:name="Unresolved Mention" w:semiHidden="1" w:unhideWhenUsed="1"/>
     <w:lsdException w:name="Smart Link" w:semiHidden="1" w:unhideWhenUsed="1"/>
   </w:latentStyles>
-  <w:style w:type="paragraph" w:default="1" w:styleId="Normal">
+  <w:style w:type="paragraph" w:default="1" w:styleId="a">
     <w:name w:val="Normal"/>
     <w:qFormat/>
   </w:style>
-  <w:style w:type="paragraph" w:styleId="Heading1">
+  <w:style w:type="paragraph" w:styleId="1">
     <w:name w:val="heading 1"/>
-    <w:basedOn w:val="Normal"/>
-    <w:next w:val="Normal"/>
-    <w:link w:val="Heading1Char"/>
+    <w:basedOn w:val="a"/>
+    <w:next w:val="a"/>
+    <w:link w:val="1Char"/>
     <w:uiPriority w:val="9"/>
     <w:qFormat/>
     <w:rsid w:val="003A3F8E"/>
@@ -966,11 +993,11 @@
       <w:szCs w:val="40"/>
     </w:rPr>
   </w:style>
-  <w:style w:type="paragraph" w:styleId="Heading2">
+  <w:style w:type="paragraph" w:styleId="2">
     <w:name w:val="heading 2"/>
-    <w:basedOn w:val="Normal"/>
-    <w:next w:val="Normal"/>
-    <w:link w:val="Heading2Char"/>
+    <w:basedOn w:val="a"/>
+    <w:next w:val="a"/>
+    <w:link w:val="2Char"/>
     <w:uiPriority w:val="9"/>
     <w:semiHidden/>
     <w:unhideWhenUsed/>
@@ -989,11 +1016,11 @@
       <w:szCs w:val="32"/>
     </w:rPr>
   </w:style>
-  <w:style w:type="paragraph" w:styleId="Heading3">
+  <w:style w:type="paragraph" w:styleId="3">
     <w:name w:val="heading 3"/>
-    <w:basedOn w:val="Normal"/>
-    <w:next w:val="Normal"/>
-    <w:link w:val="Heading3Char"/>
+    <w:basedOn w:val="a"/>
+    <w:next w:val="a"/>
+    <w:link w:val="3Char"/>
     <w:uiPriority w:val="9"/>
     <w:semiHidden/>
     <w:unhideWhenUsed/>
@@ -1012,11 +1039,11 @@
       <w:szCs w:val="28"/>
     </w:rPr>
   </w:style>
-  <w:style w:type="paragraph" w:styleId="Heading4">
+  <w:style w:type="paragraph" w:styleId="4">
     <w:name w:val="heading 4"/>
-    <w:basedOn w:val="Normal"/>
-    <w:next w:val="Normal"/>
-    <w:link w:val="Heading4Char"/>
+    <w:basedOn w:val="a"/>
+    <w:next w:val="a"/>
+    <w:link w:val="4Char"/>
     <w:uiPriority w:val="9"/>
     <w:semiHidden/>
     <w:unhideWhenUsed/>
@@ -1035,11 +1062,11 @@
       <w:color w:val="0F4761" w:themeColor="accent1" w:themeShade="BF"/>
     </w:rPr>
   </w:style>
-  <w:style w:type="paragraph" w:styleId="Heading5">
+  <w:style w:type="paragraph" w:styleId="5">
     <w:name w:val="heading 5"/>
-    <w:basedOn w:val="Normal"/>
-    <w:next w:val="Normal"/>
-    <w:link w:val="Heading5Char"/>
+    <w:basedOn w:val="a"/>
+    <w:next w:val="a"/>
+    <w:link w:val="5Char"/>
     <w:uiPriority w:val="9"/>
     <w:semiHidden/>
     <w:unhideWhenUsed/>
@@ -1056,11 +1083,11 @@
       <w:color w:val="0F4761" w:themeColor="accent1" w:themeShade="BF"/>
     </w:rPr>
   </w:style>
-  <w:style w:type="paragraph" w:styleId="Heading6">
+  <w:style w:type="paragraph" w:styleId="6">
     <w:name w:val="heading 6"/>
-    <w:basedOn w:val="Normal"/>
-    <w:next w:val="Normal"/>
-    <w:link w:val="Heading6Char"/>
+    <w:basedOn w:val="a"/>
+    <w:next w:val="a"/>
+    <w:link w:val="6Char"/>
     <w:uiPriority w:val="9"/>
     <w:semiHidden/>
     <w:unhideWhenUsed/>
@@ -1079,11 +1106,11 @@
       <w:color w:val="595959" w:themeColor="text1" w:themeTint="A6"/>
     </w:rPr>
   </w:style>
-  <w:style w:type="paragraph" w:styleId="Heading7">
+  <w:style w:type="paragraph" w:styleId="7">
     <w:name w:val="heading 7"/>
-    <w:basedOn w:val="Normal"/>
-    <w:next w:val="Normal"/>
-    <w:link w:val="Heading7Char"/>
+    <w:basedOn w:val="a"/>
+    <w:next w:val="a"/>
+    <w:link w:val="7Char"/>
     <w:uiPriority w:val="9"/>
     <w:semiHidden/>
     <w:unhideWhenUsed/>
@@ -1100,11 +1127,11 @@
       <w:color w:val="595959" w:themeColor="text1" w:themeTint="A6"/>
     </w:rPr>
   </w:style>
-  <w:style w:type="paragraph" w:styleId="Heading8">
+  <w:style w:type="paragraph" w:styleId="8">
     <w:name w:val="heading 8"/>
-    <w:basedOn w:val="Normal"/>
-    <w:next w:val="Normal"/>
-    <w:link w:val="Heading8Char"/>
+    <w:basedOn w:val="a"/>
+    <w:next w:val="a"/>
+    <w:link w:val="8Char"/>
     <w:uiPriority w:val="9"/>
     <w:semiHidden/>
     <w:unhideWhenUsed/>
@@ -1123,11 +1150,11 @@
       <w:color w:val="272727" w:themeColor="text1" w:themeTint="D8"/>
     </w:rPr>
   </w:style>
-  <w:style w:type="paragraph" w:styleId="Heading9">
+  <w:style w:type="paragraph" w:styleId="9">
     <w:name w:val="heading 9"/>
-    <w:basedOn w:val="Normal"/>
-    <w:next w:val="Normal"/>
-    <w:link w:val="Heading9Char"/>
+    <w:basedOn w:val="a"/>
+    <w:next w:val="a"/>
+    <w:link w:val="9Char"/>
     <w:uiPriority w:val="9"/>
     <w:semiHidden/>
     <w:unhideWhenUsed/>
@@ -1144,13 +1171,13 @@
       <w:color w:val="272727" w:themeColor="text1" w:themeTint="D8"/>
     </w:rPr>
   </w:style>
-  <w:style w:type="character" w:default="1" w:styleId="DefaultParagraphFont">
+  <w:style w:type="character" w:default="1" w:styleId="a0">
     <w:name w:val="Default Paragraph Font"/>
     <w:uiPriority w:val="1"/>
     <w:semiHidden/>
     <w:unhideWhenUsed/>
   </w:style>
-  <w:style w:type="table" w:default="1" w:styleId="TableNormal">
+  <w:style w:type="table" w:default="1" w:styleId="a1">
     <w:name w:val="Normal Table"/>
     <w:uiPriority w:val="99"/>
     <w:semiHidden/>
@@ -1165,16 +1192,16 @@
       </w:tblCellMar>
     </w:tblPr>
   </w:style>
-  <w:style w:type="numbering" w:default="1" w:styleId="NoList">
+  <w:style w:type="numbering" w:default="1" w:styleId="a2">
     <w:name w:val="No List"/>
     <w:uiPriority w:val="99"/>
     <w:semiHidden/>
     <w:unhideWhenUsed/>
   </w:style>
-  <w:style w:type="character" w:customStyle="1" w:styleId="Heading1Char">
-    <w:name w:val="Heading 1 Char"/>
-    <w:basedOn w:val="DefaultParagraphFont"/>
-    <w:link w:val="Heading1"/>
+  <w:style w:type="character" w:customStyle="1" w:styleId="1Char">
+    <w:name w:val="제목 1 Char"/>
+    <w:basedOn w:val="a0"/>
+    <w:link w:val="1"/>
     <w:uiPriority w:val="9"/>
     <w:rsid w:val="003A3F8E"/>
     <w:rPr>
@@ -1184,10 +1211,10 @@
       <w:szCs w:val="40"/>
     </w:rPr>
   </w:style>
-  <w:style w:type="character" w:customStyle="1" w:styleId="Heading2Char">
-    <w:name w:val="Heading 2 Char"/>
-    <w:basedOn w:val="DefaultParagraphFont"/>
-    <w:link w:val="Heading2"/>
+  <w:style w:type="character" w:customStyle="1" w:styleId="2Char">
+    <w:name w:val="제목 2 Char"/>
+    <w:basedOn w:val="a0"/>
+    <w:link w:val="2"/>
     <w:uiPriority w:val="9"/>
     <w:semiHidden/>
     <w:rsid w:val="003A3F8E"/>
@@ -1198,10 +1225,10 @@
       <w:szCs w:val="32"/>
     </w:rPr>
   </w:style>
-  <w:style w:type="character" w:customStyle="1" w:styleId="Heading3Char">
-    <w:name w:val="Heading 3 Char"/>
-    <w:basedOn w:val="DefaultParagraphFont"/>
-    <w:link w:val="Heading3"/>
+  <w:style w:type="character" w:customStyle="1" w:styleId="3Char">
+    <w:name w:val="제목 3 Char"/>
+    <w:basedOn w:val="a0"/>
+    <w:link w:val="3"/>
     <w:uiPriority w:val="9"/>
     <w:semiHidden/>
     <w:rsid w:val="003A3F8E"/>
@@ -1212,10 +1239,10 @@
       <w:szCs w:val="28"/>
     </w:rPr>
   </w:style>
-  <w:style w:type="character" w:customStyle="1" w:styleId="Heading4Char">
-    <w:name w:val="Heading 4 Char"/>
-    <w:basedOn w:val="DefaultParagraphFont"/>
-    <w:link w:val="Heading4"/>
+  <w:style w:type="character" w:customStyle="1" w:styleId="4Char">
+    <w:name w:val="제목 4 Char"/>
+    <w:basedOn w:val="a0"/>
+    <w:link w:val="4"/>
     <w:uiPriority w:val="9"/>
     <w:semiHidden/>
     <w:rsid w:val="003A3F8E"/>
@@ -1226,10 +1253,10 @@
       <w:color w:val="0F4761" w:themeColor="accent1" w:themeShade="BF"/>
     </w:rPr>
   </w:style>
-  <w:style w:type="character" w:customStyle="1" w:styleId="Heading5Char">
-    <w:name w:val="Heading 5 Char"/>
-    <w:basedOn w:val="DefaultParagraphFont"/>
-    <w:link w:val="Heading5"/>
+  <w:style w:type="character" w:customStyle="1" w:styleId="5Char">
+    <w:name w:val="제목 5 Char"/>
+    <w:basedOn w:val="a0"/>
+    <w:link w:val="5"/>
     <w:uiPriority w:val="9"/>
     <w:semiHidden/>
     <w:rsid w:val="003A3F8E"/>
@@ -1238,10 +1265,10 @@
       <w:color w:val="0F4761" w:themeColor="accent1" w:themeShade="BF"/>
     </w:rPr>
   </w:style>
-  <w:style w:type="character" w:customStyle="1" w:styleId="Heading6Char">
-    <w:name w:val="Heading 6 Char"/>
-    <w:basedOn w:val="DefaultParagraphFont"/>
-    <w:link w:val="Heading6"/>
+  <w:style w:type="character" w:customStyle="1" w:styleId="6Char">
+    <w:name w:val="제목 6 Char"/>
+    <w:basedOn w:val="a0"/>
+    <w:link w:val="6"/>
     <w:uiPriority w:val="9"/>
     <w:semiHidden/>
     <w:rsid w:val="003A3F8E"/>
@@ -1252,10 +1279,10 @@
       <w:color w:val="595959" w:themeColor="text1" w:themeTint="A6"/>
     </w:rPr>
   </w:style>
-  <w:style w:type="character" w:customStyle="1" w:styleId="Heading7Char">
-    <w:name w:val="Heading 7 Char"/>
-    <w:basedOn w:val="DefaultParagraphFont"/>
-    <w:link w:val="Heading7"/>
+  <w:style w:type="character" w:customStyle="1" w:styleId="7Char">
+    <w:name w:val="제목 7 Char"/>
+    <w:basedOn w:val="a0"/>
+    <w:link w:val="7"/>
     <w:uiPriority w:val="9"/>
     <w:semiHidden/>
     <w:rsid w:val="003A3F8E"/>
@@ -1264,10 +1291,10 @@
       <w:color w:val="595959" w:themeColor="text1" w:themeTint="A6"/>
     </w:rPr>
   </w:style>
-  <w:style w:type="character" w:customStyle="1" w:styleId="Heading8Char">
-    <w:name w:val="Heading 8 Char"/>
-    <w:basedOn w:val="DefaultParagraphFont"/>
-    <w:link w:val="Heading8"/>
+  <w:style w:type="character" w:customStyle="1" w:styleId="8Char">
+    <w:name w:val="제목 8 Char"/>
+    <w:basedOn w:val="a0"/>
+    <w:link w:val="8"/>
     <w:uiPriority w:val="9"/>
     <w:semiHidden/>
     <w:rsid w:val="003A3F8E"/>
@@ -1278,10 +1305,10 @@
       <w:color w:val="272727" w:themeColor="text1" w:themeTint="D8"/>
     </w:rPr>
   </w:style>
-  <w:style w:type="character" w:customStyle="1" w:styleId="Heading9Char">
-    <w:name w:val="Heading 9 Char"/>
-    <w:basedOn w:val="DefaultParagraphFont"/>
-    <w:link w:val="Heading9"/>
+  <w:style w:type="character" w:customStyle="1" w:styleId="9Char">
+    <w:name w:val="제목 9 Char"/>
+    <w:basedOn w:val="a0"/>
+    <w:link w:val="9"/>
     <w:uiPriority w:val="9"/>
     <w:semiHidden/>
     <w:rsid w:val="003A3F8E"/>
@@ -1290,11 +1317,11 @@
       <w:color w:val="272727" w:themeColor="text1" w:themeTint="D8"/>
     </w:rPr>
   </w:style>
-  <w:style w:type="paragraph" w:styleId="Title">
+  <w:style w:type="paragraph" w:styleId="a3">
     <w:name w:val="Title"/>
-    <w:basedOn w:val="Normal"/>
-    <w:next w:val="Normal"/>
-    <w:link w:val="TitleChar"/>
+    <w:basedOn w:val="a"/>
+    <w:next w:val="a"/>
+    <w:link w:val="Char"/>
     <w:uiPriority w:val="10"/>
     <w:qFormat/>
     <w:rsid w:val="003A3F8E"/>
@@ -1310,10 +1337,10 @@
       <w:szCs w:val="56"/>
     </w:rPr>
   </w:style>
-  <w:style w:type="character" w:customStyle="1" w:styleId="TitleChar">
-    <w:name w:val="Title Char"/>
-    <w:basedOn w:val="DefaultParagraphFont"/>
-    <w:link w:val="Title"/>
+  <w:style w:type="character" w:customStyle="1" w:styleId="Char">
+    <w:name w:val="제목 Char"/>
+    <w:basedOn w:val="a0"/>
+    <w:link w:val="a3"/>
     <w:uiPriority w:val="10"/>
     <w:rsid w:val="003A3F8E"/>
     <w:rPr>
@@ -1324,11 +1351,11 @@
       <w:szCs w:val="56"/>
     </w:rPr>
   </w:style>
-  <w:style w:type="paragraph" w:styleId="Subtitle">
+  <w:style w:type="paragraph" w:styleId="a4">
     <w:name w:val="Subtitle"/>
-    <w:basedOn w:val="Normal"/>
-    <w:next w:val="Normal"/>
-    <w:link w:val="SubtitleChar"/>
+    <w:basedOn w:val="a"/>
+    <w:next w:val="a"/>
+    <w:link w:val="Char0"/>
     <w:uiPriority w:val="11"/>
     <w:qFormat/>
     <w:rsid w:val="003A3F8E"/>
@@ -1345,10 +1372,10 @@
       <w:szCs w:val="28"/>
     </w:rPr>
   </w:style>
-  <w:style w:type="character" w:customStyle="1" w:styleId="SubtitleChar">
-    <w:name w:val="Subtitle Char"/>
-    <w:basedOn w:val="DefaultParagraphFont"/>
-    <w:link w:val="Subtitle"/>
+  <w:style w:type="character" w:customStyle="1" w:styleId="Char0">
+    <w:name w:val="부제 Char"/>
+    <w:basedOn w:val="a0"/>
+    <w:link w:val="a4"/>
     <w:uiPriority w:val="11"/>
     <w:rsid w:val="003A3F8E"/>
     <w:rPr>
@@ -1359,11 +1386,11 @@
       <w:szCs w:val="28"/>
     </w:rPr>
   </w:style>
-  <w:style w:type="paragraph" w:styleId="Quote">
+  <w:style w:type="paragraph" w:styleId="a5">
     <w:name w:val="Quote"/>
-    <w:basedOn w:val="Normal"/>
-    <w:next w:val="Normal"/>
-    <w:link w:val="QuoteChar"/>
+    <w:basedOn w:val="a"/>
+    <w:next w:val="a"/>
+    <w:link w:val="Char1"/>
     <w:uiPriority w:val="29"/>
     <w:qFormat/>
     <w:rsid w:val="003A3F8E"/>
@@ -1377,10 +1404,10 @@
       <w:color w:val="404040" w:themeColor="text1" w:themeTint="BF"/>
     </w:rPr>
   </w:style>
-  <w:style w:type="character" w:customStyle="1" w:styleId="QuoteChar">
-    <w:name w:val="Quote Char"/>
-    <w:basedOn w:val="DefaultParagraphFont"/>
-    <w:link w:val="Quote"/>
+  <w:style w:type="character" w:customStyle="1" w:styleId="Char1">
+    <w:name w:val="인용 Char"/>
+    <w:basedOn w:val="a0"/>
+    <w:link w:val="a5"/>
     <w:uiPriority w:val="29"/>
     <w:rsid w:val="003A3F8E"/>
     <w:rPr>
@@ -1389,9 +1416,9 @@
       <w:color w:val="404040" w:themeColor="text1" w:themeTint="BF"/>
     </w:rPr>
   </w:style>
-  <w:style w:type="paragraph" w:styleId="ListParagraph">
+  <w:style w:type="paragraph" w:styleId="a6">
     <w:name w:val="List Paragraph"/>
-    <w:basedOn w:val="Normal"/>
+    <w:basedOn w:val="a"/>
     <w:uiPriority w:val="34"/>
     <w:qFormat/>
     <w:rsid w:val="003A3F8E"/>
@@ -1400,9 +1427,9 @@
       <w:contextualSpacing/>
     </w:pPr>
   </w:style>
-  <w:style w:type="character" w:styleId="IntenseEmphasis">
+  <w:style w:type="character" w:styleId="a7">
     <w:name w:val="Intense Emphasis"/>
-    <w:basedOn w:val="DefaultParagraphFont"/>
+    <w:basedOn w:val="a0"/>
     <w:uiPriority w:val="21"/>
     <w:qFormat/>
     <w:rsid w:val="003A3F8E"/>
@@ -1412,11 +1439,11 @@
       <w:color w:val="0F4761" w:themeColor="accent1" w:themeShade="BF"/>
     </w:rPr>
   </w:style>
-  <w:style w:type="paragraph" w:styleId="IntenseQuote">
+  <w:style w:type="paragraph" w:styleId="a8">
     <w:name w:val="Intense Quote"/>
-    <w:basedOn w:val="Normal"/>
-    <w:next w:val="Normal"/>
-    <w:link w:val="IntenseQuoteChar"/>
+    <w:basedOn w:val="a"/>
+    <w:next w:val="a"/>
+    <w:link w:val="Char2"/>
     <w:uiPriority w:val="30"/>
     <w:qFormat/>
     <w:rsid w:val="003A3F8E"/>
@@ -1435,10 +1462,10 @@
       <w:color w:val="0F4761" w:themeColor="accent1" w:themeShade="BF"/>
     </w:rPr>
   </w:style>
-  <w:style w:type="character" w:customStyle="1" w:styleId="IntenseQuoteChar">
-    <w:name w:val="Intense Quote Char"/>
-    <w:basedOn w:val="DefaultParagraphFont"/>
-    <w:link w:val="IntenseQuote"/>
+  <w:style w:type="character" w:customStyle="1" w:styleId="Char2">
+    <w:name w:val="강한 인용 Char"/>
+    <w:basedOn w:val="a0"/>
+    <w:link w:val="a8"/>
     <w:uiPriority w:val="30"/>
     <w:rsid w:val="003A3F8E"/>
     <w:rPr>
@@ -1447,9 +1474,9 @@
       <w:color w:val="0F4761" w:themeColor="accent1" w:themeShade="BF"/>
     </w:rPr>
   </w:style>
-  <w:style w:type="character" w:styleId="IntenseReference">
+  <w:style w:type="character" w:styleId="a9">
     <w:name w:val="Intense Reference"/>
-    <w:basedOn w:val="DefaultParagraphFont"/>
+    <w:basedOn w:val="a0"/>
     <w:uiPriority w:val="32"/>
     <w:qFormat/>
     <w:rsid w:val="003A3F8E"/>
@@ -1461,10 +1488,10 @@
       <w:spacing w:val="5"/>
     </w:rPr>
   </w:style>
-  <w:style w:type="paragraph" w:styleId="Header">
+  <w:style w:type="paragraph" w:styleId="aa">
     <w:name w:val="header"/>
-    <w:basedOn w:val="Normal"/>
-    <w:link w:val="HeaderChar"/>
+    <w:basedOn w:val="a"/>
+    <w:link w:val="Char3"/>
     <w:uiPriority w:val="99"/>
     <w:unhideWhenUsed/>
     <w:rsid w:val="003A3F8E"/>
@@ -1476,17 +1503,17 @@
       <w:spacing w:after="0" w:line="240" w:lineRule="auto"/>
     </w:pPr>
   </w:style>
-  <w:style w:type="character" w:customStyle="1" w:styleId="HeaderChar">
-    <w:name w:val="Header Char"/>
-    <w:basedOn w:val="DefaultParagraphFont"/>
-    <w:link w:val="Header"/>
+  <w:style w:type="character" w:customStyle="1" w:styleId="Char3">
+    <w:name w:val="머리글 Char"/>
+    <w:basedOn w:val="a0"/>
+    <w:link w:val="aa"/>
     <w:uiPriority w:val="99"/>
     <w:rsid w:val="003A3F8E"/>
   </w:style>
-  <w:style w:type="paragraph" w:styleId="Footer">
+  <w:style w:type="paragraph" w:styleId="ab">
     <w:name w:val="footer"/>
-    <w:basedOn w:val="Normal"/>
-    <w:link w:val="FooterChar"/>
+    <w:basedOn w:val="a"/>
+    <w:link w:val="Char4"/>
     <w:uiPriority w:val="99"/>
     <w:unhideWhenUsed/>
     <w:rsid w:val="003A3F8E"/>
@@ -1498,16 +1525,16 @@
       <w:spacing w:after="0" w:line="240" w:lineRule="auto"/>
     </w:pPr>
   </w:style>
-  <w:style w:type="character" w:customStyle="1" w:styleId="FooterChar">
-    <w:name w:val="Footer Char"/>
-    <w:basedOn w:val="DefaultParagraphFont"/>
-    <w:link w:val="Footer"/>
+  <w:style w:type="character" w:customStyle="1" w:styleId="Char4">
+    <w:name w:val="바닥글 Char"/>
+    <w:basedOn w:val="a0"/>
+    <w:link w:val="ab"/>
     <w:uiPriority w:val="99"/>
     <w:rsid w:val="003A3F8E"/>
   </w:style>
-  <w:style w:type="character" w:styleId="Hyperlink">
+  <w:style w:type="character" w:styleId="ac">
     <w:name w:val="Hyperlink"/>
-    <w:basedOn w:val="DefaultParagraphFont"/>
+    <w:basedOn w:val="a0"/>
     <w:uiPriority w:val="99"/>
     <w:unhideWhenUsed/>
     <w:rsid w:val="00432309"/>
@@ -1516,9 +1543,9 @@
       <w:u w:val="single"/>
     </w:rPr>
   </w:style>
-  <w:style w:type="character" w:styleId="UnresolvedMention">
+  <w:style w:type="character" w:styleId="ad">
     <w:name w:val="Unresolved Mention"/>
-    <w:basedOn w:val="DefaultParagraphFont"/>
+    <w:basedOn w:val="a0"/>
     <w:uiPriority w:val="99"/>
     <w:semiHidden/>
     <w:unhideWhenUsed/>

</xml_diff>